<commit_message>
Align Task 1 navigation and FSM with Chapter 8
</commit_message>
<xml_diff>
--- a/CSCI_430_Project_2_Task_1_Login_Security_Navigation.docx
+++ b/CSCI_430_Project_2_Task_1_Login_Security_Navigation.docx
@@ -301,7 +301,6 @@
           <w:tcPr>
             <w:tcW w:type="dxa" w:w="1728"/>
             <w:vAlign w:val="center"/>
-            <w:shd w:fill="D9D9D9"/>
             <w:tcMar>
               <w:top w:w="90" w:type="dxa"/>
               <w:start w:w="100" w:type="dxa"/>
@@ -328,7 +327,6 @@
           <w:tcPr>
             <w:tcW w:type="dxa" w:w="3240"/>
             <w:vAlign w:val="center"/>
-            <w:shd w:fill="D9D9D9"/>
             <w:tcMar>
               <w:top w:w="90" w:type="dxa"/>
               <w:start w:w="100" w:type="dxa"/>
@@ -355,7 +353,6 @@
           <w:tcPr>
             <w:tcW w:type="dxa" w:w="3384"/>
             <w:vAlign w:val="center"/>
-            <w:shd w:fill="D9D9D9"/>
             <w:tcMar>
               <w:top w:w="90" w:type="dxa"/>
               <w:start w:w="100" w:type="dxa"/>
@@ -382,7 +379,6 @@
           <w:tcPr>
             <w:tcW w:type="dxa" w:w="2016"/>
             <w:vAlign w:val="center"/>
-            <w:shd w:fill="D9D9D9"/>
             <w:tcMar>
               <w:top w:w="90" w:type="dxa"/>
               <w:start w:w="100" w:type="dxa"/>
@@ -519,7 +515,6 @@
               <w:bottom w:w="90" w:type="dxa"/>
               <w:end w:w="100" w:type="dxa"/>
             </w:tcMar>
-            <w:shd w:fill="F2F2F2"/>
           </w:tcPr>
           <w:p>
             <w:pPr>
@@ -545,7 +540,6 @@
               <w:bottom w:w="90" w:type="dxa"/>
               <w:end w:w="100" w:type="dxa"/>
             </w:tcMar>
-            <w:shd w:fill="F2F2F2"/>
           </w:tcPr>
           <w:p>
             <w:pPr>
@@ -571,7 +565,6 @@
               <w:bottom w:w="90" w:type="dxa"/>
               <w:end w:w="100" w:type="dxa"/>
             </w:tcMar>
-            <w:shd w:fill="F2F2F2"/>
           </w:tcPr>
           <w:p>
             <w:pPr>
@@ -597,7 +590,6 @@
               <w:bottom w:w="90" w:type="dxa"/>
               <w:end w:w="100" w:type="dxa"/>
             </w:tcMar>
-            <w:shd w:fill="F2F2F2"/>
           </w:tcPr>
           <w:p>
             <w:pPr>
@@ -727,7 +719,6 @@
               <w:bottom w:w="90" w:type="dxa"/>
               <w:end w:w="100" w:type="dxa"/>
             </w:tcMar>
-            <w:shd w:fill="F2F2F2"/>
           </w:tcPr>
           <w:p>
             <w:pPr>
@@ -753,7 +744,6 @@
               <w:bottom w:w="90" w:type="dxa"/>
               <w:end w:w="100" w:type="dxa"/>
             </w:tcMar>
-            <w:shd w:fill="F2F2F2"/>
           </w:tcPr>
           <w:p>
             <w:pPr>
@@ -779,7 +769,6 @@
               <w:bottom w:w="90" w:type="dxa"/>
               <w:end w:w="100" w:type="dxa"/>
             </w:tcMar>
-            <w:shd w:fill="F2F2F2"/>
           </w:tcPr>
           <w:p>
             <w:pPr>
@@ -805,7 +794,6 @@
               <w:bottom w:w="90" w:type="dxa"/>
               <w:end w:w="100" w:type="dxa"/>
             </w:tcMar>
-            <w:shd w:fill="F2F2F2"/>
           </w:tcPr>
           <w:p>
             <w:pPr>
@@ -935,7 +923,6 @@
               <w:bottom w:w="90" w:type="dxa"/>
               <w:end w:w="100" w:type="dxa"/>
             </w:tcMar>
-            <w:shd w:fill="F2F2F2"/>
           </w:tcPr>
           <w:p>
             <w:pPr>
@@ -961,7 +948,6 @@
               <w:bottom w:w="90" w:type="dxa"/>
               <w:end w:w="100" w:type="dxa"/>
             </w:tcMar>
-            <w:shd w:fill="F2F2F2"/>
           </w:tcPr>
           <w:p>
             <w:pPr>
@@ -987,7 +973,6 @@
               <w:bottom w:w="90" w:type="dxa"/>
               <w:end w:w="100" w:type="dxa"/>
             </w:tcMar>
-            <w:shd w:fill="F2F2F2"/>
           </w:tcPr>
           <w:p>
             <w:pPr>
@@ -1013,7 +998,6 @@
               <w:bottom w:w="90" w:type="dxa"/>
               <w:end w:w="100" w:type="dxa"/>
             </w:tcMar>
-            <w:shd w:fill="F2F2F2"/>
           </w:tcPr>
           <w:p>
             <w:pPr>
@@ -1143,7 +1127,6 @@
               <w:bottom w:w="90" w:type="dxa"/>
               <w:end w:w="100" w:type="dxa"/>
             </w:tcMar>
-            <w:shd w:fill="F2F2F2"/>
           </w:tcPr>
           <w:p>
             <w:pPr>
@@ -1169,7 +1152,6 @@
               <w:bottom w:w="90" w:type="dxa"/>
               <w:end w:w="100" w:type="dxa"/>
             </w:tcMar>
-            <w:shd w:fill="F2F2F2"/>
           </w:tcPr>
           <w:p>
             <w:pPr>
@@ -1195,7 +1177,6 @@
               <w:bottom w:w="90" w:type="dxa"/>
               <w:end w:w="100" w:type="dxa"/>
             </w:tcMar>
-            <w:shd w:fill="F2F2F2"/>
           </w:tcPr>
           <w:p>
             <w:pPr>
@@ -1221,7 +1202,6 @@
               <w:bottom w:w="90" w:type="dxa"/>
               <w:end w:w="100" w:type="dxa"/>
             </w:tcMar>
-            <w:shd w:fill="F2F2F2"/>
           </w:tcPr>
           <w:p>
             <w:pPr>
@@ -1351,7 +1331,6 @@
               <w:bottom w:w="90" w:type="dxa"/>
               <w:end w:w="100" w:type="dxa"/>
             </w:tcMar>
-            <w:shd w:fill="F2F2F2"/>
           </w:tcPr>
           <w:p>
             <w:pPr>
@@ -1377,7 +1356,6 @@
               <w:bottom w:w="90" w:type="dxa"/>
               <w:end w:w="100" w:type="dxa"/>
             </w:tcMar>
-            <w:shd w:fill="F2F2F2"/>
           </w:tcPr>
           <w:p>
             <w:pPr>
@@ -1403,7 +1381,6 @@
               <w:bottom w:w="90" w:type="dxa"/>
               <w:end w:w="100" w:type="dxa"/>
             </w:tcMar>
-            <w:shd w:fill="F2F2F2"/>
           </w:tcPr>
           <w:p>
             <w:pPr>
@@ -1429,7 +1406,6 @@
               <w:bottom w:w="90" w:type="dxa"/>
               <w:end w:w="100" w:type="dxa"/>
             </w:tcMar>
-            <w:shd w:fill="F2F2F2"/>
           </w:tcPr>
           <w:p>
             <w:pPr>
@@ -1635,7 +1611,7 @@
           <w:rFonts w:ascii="Times New Roman" w:hAnsi="Times New Roman"/>
           <w:color w:val="000000"/>
         </w:rPr>
-        <w:t>Displays Login Panel, collects the selected role and credentials, calls Security, displays errors, and changes the visible panel after Security returns a result.</w:t>
+        <w:t>Displays the current panel, collects input, and sends the event and Security result to SessionContext. It displays the panel selected by the context.</w:t>
       </w:r>
     </w:p>
     <w:p>
@@ -1675,7 +1651,7 @@
           <w:rFonts w:ascii="Times New Roman" w:hAnsi="Times New Roman"/>
           <w:color w:val="000000"/>
         </w:rPr>
-        <w:t>Stores the authenticated user, current role, active client ID, and a small role stack used when one role temporarily becomes another role.</w:t>
+        <w:t>Stores the current panel, authenticated role, active client ID, and role-return history. It computes the next panel from the current panel, event, and stored information. On delegated logout it restores the previous role; on ordinary logout it clears the session and selects Login Panel. This is the centralized context approach described in Section 8.9.1.</w:t>
       </w:r>
     </w:p>
     <w:p>
@@ -1732,6 +1708,42 @@
           <w:color w:val="000000"/>
         </w:rPr>
         <w:t>The interface must also remember whether a user is temporarily acting as another role. SessionContext stores the original role, active role, active client ID, and a small role stack. The FSM controls panel changes, while ordinary objects and variables hold the changing information.</w:t>
+      </w:r>
+    </w:p>
+    <w:p>
+      <w:pPr>
+        <w:pStyle w:val="Heading1"/>
+      </w:pPr>
+      <w:r>
+        <w:rPr>
+          <w:rFonts w:ascii="Times New Roman" w:hAnsi="Times New Roman"/>
+          <w:color w:val="000000"/>
+        </w:rPr>
+        <w:t>Shared Back and Logout Rules</w:t>
+      </w:r>
+    </w:p>
+    <w:p>
+      <w:pPr>
+        <w:spacing w:after="100" w:line="259" w:lineRule="auto"/>
+      </w:pPr>
+      <w:r>
+        <w:rPr>
+          <w:rFonts w:ascii="Times New Roman" w:hAnsi="Times New Roman"/>
+          <w:color w:val="000000"/>
+        </w:rPr>
+        <w:t>Back or Quit within a sub-panel returns to its parent panel without ending the authenticated session. Login Panel has no Back option because it is the entry panel. Its Quit option closes the program. Logout from a role menu returns to Login Panel for a directly logged-in user, or restores the immediately preceding role for delegated access. Panel-return history and role-return history are kept separate so Back does not accidentally log out a user. Tasks 2 through 4 supply the individual sub-panel transitions.</w:t>
+      </w:r>
+    </w:p>
+    <w:p>
+      <w:pPr>
+        <w:spacing w:after="100" w:line="259" w:lineRule="auto"/>
+      </w:pPr>
+      <w:r>
+        <w:rPr>
+          <w:rFonts w:ascii="Times New Roman" w:hAnsi="Times New Roman"/>
+          <w:color w:val="000000"/>
+        </w:rPr>
+        <w:t>Only one panel is active at a time. Failed login leaves the interface in Login Panel. The guarded logout transitions use mutually exclusive conditions: either a previous delegated role exists or it does not. SessionContext evaluates this condition, so the next panel is unambiguous.</w:t>
       </w:r>
     </w:p>
     <w:p>

</xml_diff>

<commit_message>
Match prior assignment heading with all Group 9 members
</commit_message>
<xml_diff>
--- a/CSCI_430_Project_2_Task_1_Login_Security_Navigation.docx
+++ b/CSCI_430_Project_2_Task_1_Login_Security_Navigation.docx
@@ -37,7 +37,19 @@
           <w:rFonts w:ascii="Times New Roman" w:hAnsi="Times New Roman"/>
           <w:color w:val="000000"/>
         </w:rPr>
-        <w:t>Group 9 - Muhammad Irfan Younas</w:t>
+        <w:t>Group 9: - Abel Asfaw                               - Connor Doolittle</w:t>
+      </w:r>
+    </w:p>
+    <w:p>
+      <w:pPr>
+        <w:jc w:val="center"/>
+      </w:pPr>
+      <w:r>
+        <w:rPr>
+          <w:rFonts w:ascii="Times New Roman" w:hAnsi="Times New Roman"/>
+          <w:color w:val="000000"/>
+        </w:rPr>
+        <w:t xml:space="preserve">               - Muhammad Irfan Younas         - Ethan Manninen</w:t>
       </w:r>
     </w:p>
     <w:p>

</xml_diff>